<commit_message>
homogenitätsannahmen Plot, neue nslphom 5000 Durchläufe
</commit_message>
<xml_diff>
--- a/MeinMaterial/Besprechungen/Gespräch5.docx
+++ b/MeinMaterial/Besprechungen/Gespräch5.docx
@@ -48,85 +48,100 @@
       <w:r>
         <w:br/>
       </w:r>
-      <w:r>
-        <w:br/>
-        <w:t>nächster Prompt:</w:t>
-      </w:r>
-      <w:r>
-        <w:br/>
-      </w:r>
-      <w:r>
-        <w:t xml:space="preserve">beachte, dass ich mit dem guten </w:t>
-      </w:r>
-      <w:proofErr w:type="spellStart"/>
-      <w:r>
-        <w:t>computer</w:t>
-      </w:r>
-      <w:proofErr w:type="spellEnd"/>
-      <w:r>
-        <w:t xml:space="preserve"> ohne Blockschätzung </w:t>
-      </w:r>
-      <w:proofErr w:type="spellStart"/>
-      <w:r>
-        <w:t>nslphom</w:t>
-      </w:r>
-      <w:proofErr w:type="spellEnd"/>
-      <w:r>
-        <w:t xml:space="preserve"> anwenden werde. mache dies also ohne Blockaggregationen.</w:t>
-      </w:r>
-    </w:p>
-    <w:p>
-      <w:r>
-        <w:t xml:space="preserve">hattest du auch gecheckt, ob die korrekten </w:t>
-      </w:r>
-      <w:proofErr w:type="spellStart"/>
-      <w:r>
-        <w:t>zeilen</w:t>
-      </w:r>
-      <w:proofErr w:type="spellEnd"/>
-      <w:r>
-        <w:t xml:space="preserve"> des bootstraps mit den späteren </w:t>
-      </w:r>
-      <w:proofErr w:type="spellStart"/>
-      <w:r>
-        <w:t>zeilen</w:t>
-      </w:r>
-      <w:proofErr w:type="spellEnd"/>
-      <w:r>
-        <w:t xml:space="preserve"> für die </w:t>
-      </w:r>
-      <w:proofErr w:type="spellStart"/>
-      <w:r>
-        <w:t>regression</w:t>
-      </w:r>
-      <w:proofErr w:type="spellEnd"/>
-      <w:r>
-        <w:t xml:space="preserve"> korrekt </w:t>
-      </w:r>
-      <w:proofErr w:type="spellStart"/>
-      <w:r>
-        <w:t>gemapped</w:t>
-      </w:r>
-      <w:proofErr w:type="spellEnd"/>
-      <w:r>
-        <w:t xml:space="preserve"> wurden?</w:t>
-      </w:r>
-    </w:p>
-    <w:p>
-      <w:r>
-        <w:t xml:space="preserve">bitte auch allgemein bei doppelten Abspeicherungen in allen </w:t>
-      </w:r>
-      <w:proofErr w:type="spellStart"/>
-      <w:r>
-        <w:t>skripten</w:t>
-      </w:r>
-      <w:proofErr w:type="spellEnd"/>
-      <w:r>
-        <w:t xml:space="preserve"> immer nur </w:t>
-      </w:r>
-      <w:proofErr w:type="spellStart"/>
-      <w:r>
-        <w:t>rds</w:t>
+    </w:p>
+    <w:p>
+      <w:r>
+        <w:t>Nächster Prompt:</w:t>
+      </w:r>
+      <w:r>
+        <w:br/>
+      </w:r>
+      <w:r>
+        <w:t xml:space="preserve">ich habe test2000 </w:t>
+      </w:r>
+      <w:proofErr w:type="spellStart"/>
+      <w:r>
+        <w:t>skript</w:t>
+      </w:r>
+      <w:proofErr w:type="spellEnd"/>
+      <w:r>
+        <w:t xml:space="preserve"> mit 5300 </w:t>
+      </w:r>
+      <w:proofErr w:type="spellStart"/>
+      <w:r>
+        <w:t>einheiten</w:t>
+      </w:r>
+      <w:proofErr w:type="spellEnd"/>
+      <w:r>
+        <w:t xml:space="preserve"> durchlaufen lassen. Das </w:t>
+      </w:r>
+      <w:proofErr w:type="spellStart"/>
+      <w:r>
+        <w:t>ergebnis</w:t>
+      </w:r>
+      <w:proofErr w:type="spellEnd"/>
+      <w:r>
+        <w:t xml:space="preserve"> liegt in dem </w:t>
+      </w:r>
+      <w:proofErr w:type="spellStart"/>
+      <w:r>
+        <w:t>ordner</w:t>
+      </w:r>
+      <w:proofErr w:type="spellEnd"/>
+      <w:r>
+        <w:t xml:space="preserve"> wie es test2000 speichert (nur mit 5300 benannt). gehe soweit davon aus, als wäre das </w:t>
+      </w:r>
+      <w:proofErr w:type="spellStart"/>
+      <w:r>
+        <w:t>gesamtdeutschland</w:t>
+      </w:r>
+      <w:proofErr w:type="spellEnd"/>
+      <w:r>
+        <w:t xml:space="preserve"> gefittet worden und mache die Analyse von </w:t>
+      </w:r>
+      <w:proofErr w:type="spellStart"/>
+      <w:r>
+        <w:t>EHet</w:t>
+      </w:r>
+      <w:proofErr w:type="spellEnd"/>
+      <w:r>
+        <w:t xml:space="preserve">: </w:t>
+      </w:r>
+      <w:proofErr w:type="spellStart"/>
+      <w:r>
+        <w:t>heterogenität</w:t>
+      </w:r>
+      <w:proofErr w:type="spellEnd"/>
+      <w:r>
+        <w:t xml:space="preserve"> und somit verletzte </w:t>
+      </w:r>
+      <w:proofErr w:type="spellStart"/>
+      <w:r>
+        <w:t>homogenität</w:t>
+      </w:r>
+      <w:proofErr w:type="spellEnd"/>
+      <w:r>
+        <w:t xml:space="preserve"> prüfen. dies sollte ausgegeben werden aus dem </w:t>
+      </w:r>
+      <w:proofErr w:type="spellStart"/>
+      <w:r>
+        <w:t>modell</w:t>
+      </w:r>
+      <w:proofErr w:type="spellEnd"/>
+      <w:r>
+        <w:t xml:space="preserve"> in </w:t>
+      </w:r>
+      <w:proofErr w:type="spellStart"/>
+      <w:r>
+        <w:t>form</w:t>
+      </w:r>
+      <w:proofErr w:type="spellEnd"/>
+      <w:r>
+        <w:t xml:space="preserve"> von </w:t>
+      </w:r>
+      <w:proofErr w:type="spellStart"/>
+      <w:r>
+        <w:t>EHet</w:t>
       </w:r>
       <w:proofErr w:type="spellEnd"/>
       <w:r>
@@ -134,15 +149,170 @@
       </w:r>
       <w:proofErr w:type="spellStart"/>
       <w:r>
-        <w:t>dateien</w:t>
-      </w:r>
-      <w:proofErr w:type="spellEnd"/>
-      <w:r>
-        <w:t xml:space="preserve"> abspeichern nicht </w:t>
-      </w:r>
-      <w:proofErr w:type="spellStart"/>
-      <w:r>
-        <w:t>csv</w:t>
+        <w:t>matrixen</w:t>
+      </w:r>
+      <w:proofErr w:type="spellEnd"/>
+      <w:r>
+        <w:t xml:space="preserve"> ausgegeben. rechnet man dort die </w:t>
+      </w:r>
+      <w:proofErr w:type="spellStart"/>
+      <w:r>
+        <w:t>summe</w:t>
+      </w:r>
+      <w:proofErr w:type="spellEnd"/>
+      <w:r>
+        <w:t xml:space="preserve"> über alle </w:t>
+      </w:r>
+      <w:proofErr w:type="spellStart"/>
+      <w:r>
+        <w:t>einträge</w:t>
+      </w:r>
+      <w:proofErr w:type="spellEnd"/>
+      <w:r>
+        <w:t xml:space="preserve"> müsste man ja die </w:t>
+      </w:r>
+      <w:proofErr w:type="spellStart"/>
+      <w:r>
+        <w:t>differenz</w:t>
+      </w:r>
+      <w:proofErr w:type="spellEnd"/>
+      <w:r>
+        <w:t xml:space="preserve"> zu </w:t>
+      </w:r>
+      <w:proofErr w:type="spellStart"/>
+      <w:r>
+        <w:t>ergebissen</w:t>
+      </w:r>
+      <w:proofErr w:type="spellEnd"/>
+      <w:r>
+        <w:t xml:space="preserve"> unter </w:t>
+      </w:r>
+      <w:proofErr w:type="spellStart"/>
+      <w:r>
+        <w:t>homogenität</w:t>
+      </w:r>
+      <w:proofErr w:type="spellEnd"/>
+      <w:r>
+        <w:t xml:space="preserve"> bekommen richtig? es sind </w:t>
+      </w:r>
+      <w:proofErr w:type="spellStart"/>
+      <w:r>
+        <w:t>absolutzahlen</w:t>
+      </w:r>
+      <w:proofErr w:type="spellEnd"/>
+      <w:r>
+        <w:t xml:space="preserve"> an </w:t>
+      </w:r>
+      <w:proofErr w:type="spellStart"/>
+      <w:r>
+        <w:t>abweichungen</w:t>
+      </w:r>
+      <w:proofErr w:type="spellEnd"/>
+      <w:r>
+        <w:t xml:space="preserve"> und ich möchte, dass diese dann relativiert werden durch ihre eigene </w:t>
+      </w:r>
+      <w:proofErr w:type="spellStart"/>
+      <w:r>
+        <w:t>Wahlberechtigtengröße</w:t>
+      </w:r>
+      <w:proofErr w:type="spellEnd"/>
+      <w:r>
+        <w:t xml:space="preserve">. man kriegt ja </w:t>
+      </w:r>
+      <w:proofErr w:type="spellStart"/>
+      <w:r>
+        <w:t>EHet</w:t>
+      </w:r>
+      <w:proofErr w:type="spellEnd"/>
+      <w:r>
+        <w:t xml:space="preserve"> pro lokaler </w:t>
+      </w:r>
+      <w:proofErr w:type="spellStart"/>
+      <w:r>
+        <w:t>EInheit</w:t>
+      </w:r>
+      <w:proofErr w:type="spellEnd"/>
+      <w:r>
+        <w:t xml:space="preserve"> oder? Dann wäre mein Ziel diese Ergebnisse zu plotten um Ausreißer zu identifizieren und bestenfalls auf eine Deutschlandkarte zu plotten, damit man visuell sieht, ob bspw. eher kleinere oder abgelegener Gemeinden betroffen sind etc.</w:t>
+      </w:r>
+    </w:p>
+    <w:p>
+      <w:r>
+        <w:t xml:space="preserve">wie besprochen dann für </w:t>
+      </w:r>
+      <w:proofErr w:type="spellStart"/>
+      <w:r>
+        <w:t>einträge</w:t>
+      </w:r>
+      <w:proofErr w:type="spellEnd"/>
+      <w:r>
+        <w:t xml:space="preserve"> i </w:t>
+      </w:r>
+    </w:p>
+    <w:p>
+      <w:r>
+        <w:t xml:space="preserve">0.5 * </w:t>
+      </w:r>
+      <w:proofErr w:type="spellStart"/>
+      <w:r>
+        <w:t>sum</w:t>
+      </w:r>
+      <w:proofErr w:type="spellEnd"/>
+      <w:r>
+        <w:t>(</w:t>
+      </w:r>
+      <w:proofErr w:type="spellStart"/>
+      <w:r>
+        <w:t>abs</w:t>
+      </w:r>
+      <w:proofErr w:type="spellEnd"/>
+      <w:r>
+        <w:t>(</w:t>
+      </w:r>
+      <w:proofErr w:type="spellStart"/>
+      <w:r>
+        <w:t>EHet_i</w:t>
+      </w:r>
+      <w:proofErr w:type="spellEnd"/>
+      <w:r>
+        <w:t xml:space="preserve">, )) / </w:t>
+      </w:r>
+      <w:proofErr w:type="spellStart"/>
+      <w:r>
+        <w:t>Wahlberechtigte_i</w:t>
+      </w:r>
+      <w:proofErr w:type="spellEnd"/>
+    </w:p>
+    <w:p>
+      <w:r>
+        <w:t xml:space="preserve">dann kommt für jede </w:t>
+      </w:r>
+      <w:proofErr w:type="spellStart"/>
+      <w:r>
+        <w:t>einheit</w:t>
+      </w:r>
+      <w:proofErr w:type="spellEnd"/>
+      <w:r>
+        <w:t xml:space="preserve"> ein Wert raus. mit diesen Werten machen wir dann unsere Grafik:</w:t>
+      </w:r>
+    </w:p>
+    <w:p>
+      <w:proofErr w:type="spellStart"/>
+      <w:r>
+        <w:t>agg.schlüssel</w:t>
+      </w:r>
+      <w:proofErr w:type="spellEnd"/>
+      <w:r>
+        <w:t xml:space="preserve"> in einzelne Gemeindeschlüssel splitten.</w:t>
+      </w:r>
+    </w:p>
+    <w:p>
+      <w:r>
+        <w:t xml:space="preserve">Gemeindeschlüssel an Geometrien </w:t>
+      </w:r>
+      <w:proofErr w:type="spellStart"/>
+      <w:r>
+        <w:t>joinen</w:t>
       </w:r>
       <w:proofErr w:type="spellEnd"/>
       <w:r>
@@ -151,39 +321,62 @@
     </w:p>
     <w:p>
       <w:r>
-        <w:t xml:space="preserve">bitte </w:t>
-      </w:r>
-      <w:proofErr w:type="spellStart"/>
-      <w:r>
-        <w:t>functions.R</w:t>
-      </w:r>
-      <w:proofErr w:type="spellEnd"/>
-      <w:r>
-        <w:t xml:space="preserve"> nicht nur source() und das wars. ändere bitte die dateipfade in den </w:t>
-      </w:r>
-      <w:proofErr w:type="spellStart"/>
-      <w:r>
-        <w:t>skripten</w:t>
-      </w:r>
-      <w:proofErr w:type="spellEnd"/>
-      <w:r>
-        <w:t xml:space="preserve"> an, die die </w:t>
-      </w:r>
-      <w:proofErr w:type="spellStart"/>
-      <w:r>
-        <w:t>functions.R</w:t>
-      </w:r>
-      <w:proofErr w:type="spellEnd"/>
-      <w:r>
-        <w:t xml:space="preserve"> Datei aufrufen, sodass diese Datei nicht mehr nötig ist, weil es ja die </w:t>
-      </w:r>
-      <w:proofErr w:type="spellStart"/>
-      <w:r>
-        <w:t>general_functions.R</w:t>
-      </w:r>
-      <w:proofErr w:type="spellEnd"/>
-      <w:r>
-        <w:t xml:space="preserve"> gibt</w:t>
+        <w:t xml:space="preserve">Alle Gemeinden innerhalb eines </w:t>
+      </w:r>
+      <w:proofErr w:type="spellStart"/>
+      <w:r>
+        <w:t>agg.schlüssel</w:t>
+      </w:r>
+      <w:proofErr w:type="spellEnd"/>
+      <w:r>
+        <w:t xml:space="preserve"> mit sf::</w:t>
+      </w:r>
+      <w:proofErr w:type="spellStart"/>
+      <w:r>
+        <w:t>st_union</w:t>
+      </w:r>
+      <w:proofErr w:type="spellEnd"/>
+      <w:r>
+        <w:t>() zusammenfassen.</w:t>
+      </w:r>
+    </w:p>
+    <w:p>
+      <w:r>
+        <w:t xml:space="preserve">Heterogenitätswert an diese Geometrie </w:t>
+      </w:r>
+      <w:proofErr w:type="spellStart"/>
+      <w:r>
+        <w:t>joinen</w:t>
+      </w:r>
+      <w:proofErr w:type="spellEnd"/>
+      <w:r>
+        <w:t>.</w:t>
+      </w:r>
+    </w:p>
+    <w:p>
+      <w:r>
+        <w:t xml:space="preserve">Mit ggplot2 + </w:t>
+      </w:r>
+      <w:proofErr w:type="spellStart"/>
+      <w:r>
+        <w:t>geom_sf</w:t>
+      </w:r>
+      <w:proofErr w:type="spellEnd"/>
+      <w:r>
+        <w:t>() einfärben.</w:t>
+      </w:r>
+    </w:p>
+    <w:p>
+      <w:r>
+        <w:t xml:space="preserve">dabei liegt die </w:t>
+      </w:r>
+      <w:proofErr w:type="spellStart"/>
+      <w:r>
+        <w:t>gemeindeflächendatei</w:t>
+      </w:r>
+      <w:proofErr w:type="spellEnd"/>
+      <w:r>
+        <w:t xml:space="preserve"> unter </w:t>
       </w:r>
     </w:p>
     <w:p/>
@@ -326,6 +519,7 @@
     </w:p>
     <w:p>
       <w:r>
+        <w:lastRenderedPageBreak/>
         <w:t xml:space="preserve">Mit </w:t>
       </w:r>
       <w:proofErr w:type="spellStart"/>
@@ -413,6 +607,32 @@
       <w:r>
         <w:t>)</w:t>
       </w:r>
+    </w:p>
+    <w:p>
+      <w:proofErr w:type="spellStart"/>
+      <w:r>
+        <w:t>Iter_max</w:t>
+      </w:r>
+      <w:proofErr w:type="spellEnd"/>
+      <w:r>
+        <w:t xml:space="preserve">: ist 10 wirklich optimal? (siehe neues Material) kann mit höheren </w:t>
+      </w:r>
+      <w:proofErr w:type="spellStart"/>
+      <w:r>
+        <w:t>iter_max</w:t>
+      </w:r>
+      <w:proofErr w:type="spellEnd"/>
+      <w:r>
+        <w:t xml:space="preserve"> überprüfen wie sich (Heterogenität </w:t>
+      </w:r>
+      <w:proofErr w:type="spellStart"/>
+      <w:r>
+        <w:t>EHet</w:t>
+      </w:r>
+      <w:proofErr w:type="spellEnd"/>
+      <w:r>
+        <w:t>??) verhält</w:t>
+      </w:r>
       <w:r>
         <w:br/>
       </w:r>
@@ -457,7 +677,6 @@
           <w:b/>
           <w:bCs/>
         </w:rPr>
-        <w:lastRenderedPageBreak/>
         <w:t xml:space="preserve">Validierung der </w:t>
       </w:r>
       <w:proofErr w:type="spellStart"/>

</xml_diff>